<commit_message>
clean up and prepare for review 2
</commit_message>
<xml_diff>
--- a/docs/diagrams/Features/Mainflows, Actors.docx
+++ b/docs/diagrams/Features/Mainflows, Actors.docx
@@ -3901,6 +3901,19 @@
           <w:lang w:val="vi-VN"/>
         </w:rPr>
       </w:pPr>
+    </w:p>
+    <w:p>
+      <w:pPr>
+        <w:pStyle w:val="Heading1"/>
+      </w:pPr>
+      <w:r>
+        <w:t>Cập nhật Mainflow 1 — thống nhất 19/10/2026</w:t>
+      </w:r>
+    </w:p>
+    <w:p>
+      <w:r>
+        <w:t>Nội dung này thay thế quy tắc mission version trong sơ đồ cũ. Chỉ có một mission hiện hành. Mỗi lần sửa, dù mission đã được duyệt hay chưa, đều lưu riêng nội dung đề nghị và gửi Manager review. Approve áp dụng nội dung vào cùng mission; reject giữ nội dung hiện hành. Mission đã Approved vẫn giữ Approved nếu đề nghị sửa bị từ chối. Trạng thái đề nghị tách khỏi trạng thái mission; lịch sử lưu yêu cầu và quyết định, không phải mission version. Không thay đổi giới hạn sửa khi In Progress/Completed. Mainflow 2 giữ nguyên.</w:t>
+      </w:r>
     </w:p>
     <w:sectPr>
       <w:pgSz w:w="11906" w:h="16838"/>

</xml_diff>